<commit_message>
feat(discover-aging): absolute national burden + threshold/age robustness
Easy high-value additions:
- Absolute population burden via LASI population-expansion weights: ~18M older
  Indians with undiagnosed diabetes, 46M undiagnosed hypertension, 73M uncontrolled
  hypertension, 76M anaemia (Table S11). Adds a policy headline to abstract + results.
- Threshold sensitivity (HbA1c>=7.0; ACC/AHA BP>=130/80 -> 70% undiagnosed; CRP>10)
  confirms robustness; primary thresholds are conservative (Table S12).
- Age-group stratification: diagnosis gap widest at 45-59 (Table S13).

analysis/10_absolute_burden_sensitivity.py; supplement rebuilt to S13; manuscript
abstract/results/methods updated; cross-references re-audited; docx regenerated.

Co-Authored-By: Claude Fable 5 <noreply@anthropic.com>
</commit_message>
<xml_diff>
--- a/india-ageing-atlas/biological_age_gap_2026/submission_assets/docx/01_manuscript_Discover_Aging.docx
+++ b/india-ageing-atlas/biological_age_gap_2026/submission_assets/docx/01_manuscript_Discover_Aging.docx
@@ -128,7 +128,7 @@
         <w:t xml:space="preserve"> </w:t>
       </w:r>
       <w:r>
-        <w:t xml:space="preserve">Among 66,470 adults, 51.3% (95% CI 49.8–52.7) of biochemical diabetes (HbA1c ≥ 6.5%) and 63.8% (62.8–65.0) of measured hypertension (≥140/90 mmHg) were undiagnosed. Across the full cascade, only 39.6% of all affected diabetics and 35.8% of all affected hypertensives were controlled. Undiagnosed disease and deficit burden (anaemia, low grip strength) were concentrated among the poor (Erreygers index for undiagnosed diabetes −0.090; anaemia −0.038; low grip −0.067), whereas cardiometabolic excess was concentrated among the rich (central obesity +0.132; dysglycaemia +0.036) — a socially split dual burden of ageing. Measured biomarker burden added little to self-reported disease for predicting hospitalisation overall (AUROC 0.614→0.615), but among the 47% reporting no diagnosed condition, 15.5% had high biological burden and each additional abnormal system independently raised hospitalisation odds (OR 1.10, 1.03–1.18).</w:t>
+        <w:t xml:space="preserve">Among 66,470 adults, 51.3% (95% CI 49.8–52.7) of biochemical diabetes (HbA1c ≥ 6.5%) and 63.8% (62.8–65.0) of measured hypertension (≥140/90 mmHg) were undiagnosed — an estimated 18 million and 46 million older Indians respectively. Across the full cascade, only 39.6% of all affected diabetics and 35.8% of all affected hypertensives were controlled. Undiagnosed disease and deficit burden (anaemia, low grip strength) were concentrated among the poor (Erreygers index for undiagnosed diabetes −0.090; anaemia −0.038; low grip −0.067), whereas cardiometabolic excess was concentrated among the rich (central obesity +0.132; dysglycaemia +0.036) — a socially split dual burden of ageing. Measured biomarker burden added little to self-reported disease for predicting hospitalisation overall (AUROC 0.614→0.615), but among the 47% reporting no diagnosed condition, 15.5% had high biological burden and each additional abnormal system independently raised hospitalisation odds (OR 1.10, 1.03–1.18).</w:t>
       </w:r>
     </w:p>
     <w:p>
@@ -729,7 +729,7 @@
         <w:pStyle w:val="FirstParagraph"/>
       </w:pPr>
       <w:r>
-        <w:t xml:space="preserve">Estimates used LASI person and biomarker module weights. Variance accounted for the survey design through clustering on the secondary sampling unit (SSU): headline prevalences, the cascade, and concentration indices carry 95% confidence intervals from a cluster bootstrap (resampling SSUs), and key regression associations were corroborated by SSU cluster-bootstrap confidence intervals (Supplementary Table S3). Social patterning was described by design-weighted prevalence across residence, education, wealth and sex strata, and modelled with weighted logistic (per abnormality) and Poisson (count) regression. Socioeconomic inequality, ranked by household wealth, was summarised with the wealth-ranked concentration index, Erreygers-corrected for bounded outcomes [21, 22]. Incremental predictive value for hospitalisation was assessed with nested weighted logistic models — (1) age and sex; (2) plus simple social and behavioural indicators; (3) plus self-reported disease count; (4) plus measured biomarker burden — compared on the area under the receiver-operating-characteristic curve (AUROC, with bootstrap confidence intervals) and the Akaike information criterion (AIC), and additionally within the subgroup reporting no diagnosed condition. Analyses used Python 3 (pandas, statsmodels, scikit-learn, geopandas); code is available (see Data availability). Results are associational; no causal interpretation is intended.</w:t>
+        <w:t xml:space="preserve">Estimates used LASI person and biomarker module weights. Variance accounted for the survey design through clustering on the secondary sampling unit (SSU): headline prevalences, the cascade, and concentration indices carry 95% confidence intervals from a cluster bootstrap (resampling SSUs), and key regression associations were corroborated by SSU cluster-bootstrap confidence intervals (Supplementary Table S3). Social patterning was described by design-weighted prevalence across residence, education, wealth and sex strata, and modelled with weighted logistic (per abnormality) and Poisson (count) regression. Socioeconomic inequality, ranked by household wealth, was summarised with the wealth-ranked concentration index, Erreygers-corrected for bounded outcomes [21, 22]. Incremental predictive value for hospitalisation was assessed with nested weighted logistic models — (1) age and sex; (2) plus simple social and behavioural indicators; (3) plus self-reported disease count; (4) plus measured biomarker burden — compared on the area under the receiver-operating-characteristic curve (AUROC, with bootstrap confidence intervals) and the Akaike information criterion (AIC), and additionally within the subgroup reporting no diagnosed condition. Absolute national counts were obtained by applying the LASI population-expansion (biomarker) weights, which sum to the represented DBS-eligible population aged 45 and older. Robustness was examined under alternative clinical thresholds and across age groups (45–59, 60–74, 75+). Analyses used Python 3 (pandas, statsmodels, scikit-learn, geopandas); code is available (see Data availability). Results are associational; no causal interpretation is intended.</w:t>
       </w:r>
     </w:p>
     <w:p>
@@ -795,7 +795,23 @@
         <w:t xml:space="preserve">51.3% (49.8–52.7) of diabetes and 63.8% (62.8–65.0) of hypertension were undiagnosed</w:t>
       </w:r>
       <w:r>
-        <w:t xml:space="preserve">. Anaemia affected 29.9% (29.2–30.7), elevated CRP 9.6% (9.2–9.9) and central obesity 47.3% (46.2–48.3). Nearly one in four older adults (23.2%, 22.6–23.9) had high multi-system burden (≥3 of seven abnormal systems).</w:t>
+        <w:t xml:space="preserve">. Applying LASI population-expansion weights, this corresponds to an estimated</w:t>
+      </w:r>
+      <w:r>
+        <w:t xml:space="preserve"> </w:t>
+      </w:r>
+      <w:r>
+        <w:rPr>
+          <w:b/>
+          <w:bCs/>
+        </w:rPr>
+        <w:t xml:space="preserve">18 million older Indians with undiagnosed diabetes and 46 million with undiagnosed hypertension</w:t>
+      </w:r>
+      <w:r>
+        <w:t xml:space="preserve"> </w:t>
+      </w:r>
+      <w:r>
+        <w:t xml:space="preserve">(Supplementary Table S11). Anaemia affected 29.9% (29.2–30.7), elevated CRP 9.6% (9.2–9.9) and central obesity 47.3% (46.2–48.3). Nearly one in four older adults (23.2%, 22.6–23.9) had high multi-system burden (≥3 of seven abnormal systems). Findings were robust to alternative clinical thresholds (under the stricter ACC/AHA ≥130/80 mmHg threshold the undiagnosed hypertension fraction rose to 70%) and the diagnosis gap persisted across age groups, being widest at ages 45–59 (Supplementary Tables S12–S13).</w:t>
       </w:r>
     </w:p>
     <w:bookmarkEnd w:id="20"/>

</xml_diff>

<commit_message>
fix(discover-aging): reference-audit corrections (refs 1, 8, 13)
External reference audit (20/23 already correct). Applied:
- Ref 1: add IIPS as joint author (IIPS & UNFPA, India Ageing Report 2023).
- Ref 8: sharpen to "Harmonized LASI, Version A.3" and state explicitly it is the
  full LASI, not LASI-DAD. Verified locally: file label "Harmonized LASI Ver.A3",
  73,408 rows (LASI-DAD is ~4,000) — source confirmed as full Harmonized LASI.
- Ref 13: expand Pearson title to the full CDC/AHA statement title.

Co-Authored-By: Claude Fable 5 <noreply@anthropic.com>
</commit_message>
<xml_diff>
--- a/india-ageing-atlas/biological_age_gap_2026/submission_assets/docx/01_manuscript_Discover_Aging.docx
+++ b/india-ageing-atlas/biological_age_gap_2026/submission_assets/docx/01_manuscript_Discover_Aging.docx
@@ -2673,7 +2673,7 @@
         </w:numPr>
       </w:pPr>
       <w:r>
-        <w:t xml:space="preserve">United Nations Population Fund. India Ageing Report 2023: Caring for our elders — institutional responses. New Delhi: UNFPA India; 2023. Available from: https://india.unfpa.org/en/publications/india-ageing-report-2023 (accessed 12 June 2026).</w:t>
+        <w:t xml:space="preserve">International Institute for Population Sciences, United Nations Population Fund. India Ageing Report 2023: caring for our elders — institutional responses. New Delhi: UNFPA; 2023. Available from: https://india.unfpa.org/en/publications/india-ageing-report-2023 (accessed 12 June 2026).</w:t>
       </w:r>
     </w:p>
     <w:p>
@@ -2757,7 +2757,7 @@
         </w:numPr>
       </w:pPr>
       <w:r>
-        <w:t xml:space="preserve">Gateway to Global Aging Data. Harmonized LASI documentation (version A.3, 2017–2021). Los Angeles: University of Southern California; 2023. Available from: https://g2aging.org (accessed 12 June 2026).</w:t>
+        <w:t xml:space="preserve">Gateway to Global Aging Data. Harmonized LASI, Version A.3 (full Longitudinal Ageing Study in India; not LASI-DAD). Los Angeles: University of Southern California; 2023. Available from: https://g2aging.org (accessed 12 June 2026).</w:t>
       </w:r>
     </w:p>
     <w:p>
@@ -2817,7 +2817,7 @@
         </w:numPr>
       </w:pPr>
       <w:r>
-        <w:t xml:space="preserve">Pearson TA, Mensah GA, Alexander RW, Anderson JL, Cannon RO 3rd, Criqui M, et al. Markers of inflammation and cardiovascular disease: application to clinical and public health practice. Circulation. 2003;107(3):499–511. https://doi.org/10.1161/01.CIR.0000052939.59093.45.</w:t>
+        <w:t xml:space="preserve">Pearson TA, Mensah GA, Alexander RW, Anderson JL, Cannon RO 3rd, Criqui M, et al. Markers of inflammation and cardiovascular disease: application to clinical and public health practice: a statement for healthcare professionals from the Centers for Disease Control and Prevention and the American Heart Association. Circulation. 2003;107(3):499–511. https://doi.org/10.1161/01.CIR.0000052939.59093.45.</w:t>
       </w:r>
     </w:p>
     <w:p>

</xml_diff>